<commit_message>
Add 5-Image Visual Gallery & Verified Remote Agent Proofs to README
</commit_message>
<xml_diff>
--- a/AegisSOC_Complete_Project_Guide.docx
+++ b/AegisSOC_Complete_Project_Guide.docx
@@ -13,7 +13,7 @@
           <w:color w:val="064E8A"/>
           <w:sz w:val="44"/>
         </w:rPr>
-        <w:t>🛡️ AegisSOC Multi-Node Distributed SIEM System</w:t>
+        <w:t>🛡️ AegisSOC Global Distributed Multi-Node SIEM System</w:t>
         <w:br/>
         <w:t>Complete End-to-End Project Documentation</w:t>
       </w:r>
@@ -28,7 +28,7 @@
           <w:color w:val="666666"/>
           <w:sz w:val="20"/>
         </w:rPr>
-        <w:t>Verified Live Multi-Node Test: WIN-RJCSG0BSFFA (192.168.0.181) -&gt; SIEM Server (192.168.0.128:8000)</w:t>
+        <w:t>Verified Live Multi-Node Demonstration Gallery | WIN-RJCSG0BSFFA (192.168.0.181) -&gt; SIEM Server (192.168.0.128:8000)</w:t>
       </w:r>
     </w:p>
     <w:p/>
@@ -40,7 +40,7 @@
         <w:rPr>
           <w:color w:val="064E8A"/>
         </w:rPr>
-        <w:t>1. Executive Summary &amp; Verified Multi-Node Live Test</w:t>
+        <w:t>1. Executive Summary &amp; Verified Live Visual Gallery</w:t>
       </w:r>
     </w:p>
     <w:p>
@@ -53,20 +53,20 @@
         <w:pStyle w:val="Heading2"/>
       </w:pPr>
       <w:r>
-        <w:t>Verified Live Network Agent Connection Log:</w:t>
+        <w:t>Verified Live Network Screenshots (5-Image Gallery):</w:t>
       </w:r>
     </w:p>
     <w:p>
       <w:r>
-        <w:t xml:space="preserve"> • Target Hostname: WIN-RJCSG0BSFFA</w:t>
+        <w:t>1. Remote Agent Terminal (agent.py): Live execution on remote target WIN-RJCSG0BSFFA (192.168.0.181) streaming Event IDs 5156, 1102, 4624, 4688.</w:t>
         <w:br/>
-        <w:t xml:space="preserve"> • Agent ID: AGENT-WIN-RJCSG0BSFFA</w:t>
+        <w:t>2. Command Center HUD: 4 Fleet Nodes Active, 203+ EPS ingestion velocity, 88% Fleet Health Score, and Lateral Movement Warning Banner.</w:t>
         <w:br/>
-        <w:t xml:space="preserve"> • Target Local IP: 192.168.0.181</w:t>
+        <w:t>3. SIEM Log Workbench: Live streaming log grid displaying 38+ real-time events across WIN-RJCSG0BSFFA and fleet nodes.</w:t>
         <w:br/>
-        <w:t xml:space="preserve"> • SIEM Server URL: http://192.168.0.128:8000</w:t>
+        <w:t>4. Registered Fleet Management: Active fleet cards displaying WIN-RJCSG0BSFFA (Friend PC) registered live alongside fleet nodes.</w:t>
         <w:br/>
-        <w:t xml:space="preserve"> • Status: Successfully registered agent &amp; streaming live telemetry (Events 5156, 1102, 4624, 4688).</w:t>
+        <w:t>5. MITRE ATT&amp;CK Matrix &amp; Incidents: Automated threat correlation for WIN-RJCSG0BSFFA under TA0002 Execution (PowerShell Execution T1059.001) &amp; TA0005 Defense Evasion (Clear Event Logs T1070.001) with 1-click Host Isolation playbooks.</w:t>
       </w:r>
     </w:p>
     <w:sectPr>

</xml_diff>